<commit_message>
Add DDPM vs DDIM to readme
Highlight the differences of the two reverse diffusion
sampling processes.
</commit_message>
<xml_diff>
--- a/Images/diffusion.docx
+++ b/Images/diffusion.docx
@@ -2414,13 +2414,7 @@
                     <w:rPr>
                       <w:rFonts w:ascii="Cambria Math" w:eastAsiaTheme="minorEastAsia" w:hAnsi="Cambria Math"/>
                     </w:rPr>
-                    <m:t>,t</m:t>
-                  </m:r>
-                  <m:r>
-                    <w:rPr>
-                      <w:rFonts w:ascii="Cambria Math" w:eastAsiaTheme="minorEastAsia" w:hAnsi="Cambria Math"/>
-                    </w:rPr>
-                    <m:t>,∅</m:t>
+                    <m:t>,t,∅</m:t>
                   </m:r>
                 </m:e>
               </m:d>
@@ -2440,8 +2434,400 @@
       <w:pPr>
         <w:rPr>
           <w:rFonts w:eastAsiaTheme="minorEastAsia"/>
-        </w:rPr>
-      </w:pPr>
+          <w:b/>
+          <w:i/>
+        </w:rPr>
+      </w:pPr>
+      <m:oMathPara>
+        <m:oMath>
+          <m:sSub>
+            <m:sSubPr>
+              <m:ctrlPr>
+                <w:rPr>
+                  <w:rFonts w:ascii="Cambria Math" w:eastAsiaTheme="minorEastAsia" w:hAnsi="Cambria Math"/>
+                  <w:i/>
+                </w:rPr>
+              </m:ctrlPr>
+            </m:sSubPr>
+            <m:e>
+              <m:r>
+                <m:rPr>
+                  <m:sty m:val="bi"/>
+                </m:rPr>
+                <w:rPr>
+                  <w:rFonts w:ascii="Cambria Math" w:eastAsiaTheme="minorEastAsia" w:hAnsi="Cambria Math"/>
+                </w:rPr>
+                <m:t>x</m:t>
+              </m:r>
+            </m:e>
+            <m:sub>
+              <m:r>
+                <w:rPr>
+                  <w:rFonts w:ascii="Cambria Math" w:eastAsiaTheme="minorEastAsia" w:hAnsi="Cambria Math"/>
+                </w:rPr>
+                <m:t>t-s</m:t>
+              </m:r>
+            </m:sub>
+          </m:sSub>
+          <m:r>
+            <w:rPr>
+              <w:rFonts w:ascii="Cambria Math" w:eastAsiaTheme="minorEastAsia" w:hAnsi="Cambria Math"/>
+            </w:rPr>
+            <m:t>=</m:t>
+          </m:r>
+          <m:rad>
+            <m:radPr>
+              <m:degHide m:val="on"/>
+              <m:ctrlPr>
+                <w:rPr>
+                  <w:rFonts w:ascii="Cambria Math" w:eastAsiaTheme="minorEastAsia" w:hAnsi="Cambria Math"/>
+                  <w:i/>
+                </w:rPr>
+              </m:ctrlPr>
+            </m:radPr>
+            <m:deg/>
+            <m:e>
+              <m:sSub>
+                <m:sSubPr>
+                  <m:ctrlPr>
+                    <w:rPr>
+                      <w:rFonts w:ascii="Cambria Math" w:eastAsiaTheme="minorEastAsia" w:hAnsi="Cambria Math" w:cstheme="minorHAnsi"/>
+                      <w:i/>
+                    </w:rPr>
+                  </m:ctrlPr>
+                </m:sSubPr>
+                <m:e>
+                  <m:acc>
+                    <m:accPr>
+                      <m:chr m:val="̅"/>
+                      <m:ctrlPr>
+                        <w:rPr>
+                          <w:rFonts w:ascii="Cambria Math" w:eastAsiaTheme="minorEastAsia" w:hAnsi="Cambria Math" w:cstheme="minorHAnsi"/>
+                          <w:i/>
+                        </w:rPr>
+                      </m:ctrlPr>
+                    </m:accPr>
+                    <m:e>
+                      <m:r>
+                        <w:rPr>
+                          <w:rFonts w:ascii="Cambria Math" w:eastAsiaTheme="minorEastAsia" w:cstheme="minorHAnsi"/>
+                        </w:rPr>
+                        <m:t>a</m:t>
+                      </m:r>
+                    </m:e>
+                  </m:acc>
+                </m:e>
+                <m:sub>
+                  <m:r>
+                    <w:rPr>
+                      <w:rFonts w:ascii="Cambria Math" w:eastAsiaTheme="minorEastAsia" w:hAnsi="Cambria Math" w:cstheme="minorHAnsi"/>
+                    </w:rPr>
+                    <m:t>t-s</m:t>
+                  </m:r>
+                </m:sub>
+              </m:sSub>
+            </m:e>
+          </m:rad>
+          <m:d>
+            <m:dPr>
+              <m:ctrlPr>
+                <w:rPr>
+                  <w:rFonts w:ascii="Cambria Math" w:eastAsiaTheme="minorEastAsia" w:hAnsi="Cambria Math"/>
+                  <w:i/>
+                </w:rPr>
+              </m:ctrlPr>
+            </m:dPr>
+            <m:e>
+              <m:f>
+                <m:fPr>
+                  <m:ctrlPr>
+                    <w:rPr>
+                      <w:rFonts w:ascii="Cambria Math" w:eastAsiaTheme="minorEastAsia" w:hAnsi="Cambria Math"/>
+                      <w:i/>
+                    </w:rPr>
+                  </m:ctrlPr>
+                </m:fPr>
+                <m:num>
+                  <m:sSub>
+                    <m:sSubPr>
+                      <m:ctrlPr>
+                        <w:rPr>
+                          <w:rFonts w:ascii="Cambria Math" w:eastAsiaTheme="minorEastAsia" w:hAnsi="Cambria Math"/>
+                          <w:i/>
+                        </w:rPr>
+                      </m:ctrlPr>
+                    </m:sSubPr>
+                    <m:e>
+                      <m:r>
+                        <m:rPr>
+                          <m:sty m:val="bi"/>
+                        </m:rPr>
+                        <w:rPr>
+                          <w:rFonts w:ascii="Cambria Math" w:eastAsiaTheme="minorEastAsia" w:hAnsi="Cambria Math"/>
+                        </w:rPr>
+                        <m:t>x</m:t>
+                      </m:r>
+                    </m:e>
+                    <m:sub>
+                      <m:r>
+                        <w:rPr>
+                          <w:rFonts w:ascii="Cambria Math" w:eastAsiaTheme="minorEastAsia" w:hAnsi="Cambria Math"/>
+                        </w:rPr>
+                        <m:t>t</m:t>
+                      </m:r>
+                    </m:sub>
+                  </m:sSub>
+                  <m:r>
+                    <w:rPr>
+                      <w:rFonts w:ascii="Cambria Math" w:eastAsiaTheme="minorEastAsia" w:hAnsi="Cambria Math"/>
+                    </w:rPr>
+                    <m:t>-</m:t>
+                  </m:r>
+                  <m:rad>
+                    <m:radPr>
+                      <m:degHide m:val="on"/>
+                      <m:ctrlPr>
+                        <w:rPr>
+                          <w:rFonts w:ascii="Cambria Math" w:eastAsiaTheme="minorEastAsia" w:hAnsi="Cambria Math"/>
+                          <w:i/>
+                        </w:rPr>
+                      </m:ctrlPr>
+                    </m:radPr>
+                    <m:deg/>
+                    <m:e>
+                      <m:r>
+                        <w:rPr>
+                          <w:rFonts w:ascii="Cambria Math" w:eastAsiaTheme="minorEastAsia" w:hAnsi="Cambria Math"/>
+                        </w:rPr>
+                        <m:t>1-</m:t>
+                      </m:r>
+                      <m:sSub>
+                        <m:sSubPr>
+                          <m:ctrlPr>
+                            <w:rPr>
+                              <w:rFonts w:ascii="Cambria Math" w:eastAsiaTheme="minorEastAsia" w:hAnsi="Cambria Math" w:cstheme="minorHAnsi"/>
+                              <w:i/>
+                            </w:rPr>
+                          </m:ctrlPr>
+                        </m:sSubPr>
+                        <m:e>
+                          <m:acc>
+                            <m:accPr>
+                              <m:chr m:val="̅"/>
+                              <m:ctrlPr>
+                                <w:rPr>
+                                  <w:rFonts w:ascii="Cambria Math" w:eastAsiaTheme="minorEastAsia" w:hAnsi="Cambria Math" w:cstheme="minorHAnsi"/>
+                                  <w:i/>
+                                </w:rPr>
+                              </m:ctrlPr>
+                            </m:accPr>
+                            <m:e>
+                              <m:r>
+                                <w:rPr>
+                                  <w:rFonts w:ascii="Cambria Math" w:eastAsiaTheme="minorEastAsia" w:hAnsi="Cambria Math" w:cstheme="minorHAnsi"/>
+                                </w:rPr>
+                                <m:t>a</m:t>
+                              </m:r>
+                            </m:e>
+                          </m:acc>
+                        </m:e>
+                        <m:sub>
+                          <m:r>
+                            <w:rPr>
+                              <w:rFonts w:ascii="Cambria Math" w:eastAsiaTheme="minorEastAsia" w:hAnsi="Cambria Math" w:cstheme="minorHAnsi"/>
+                            </w:rPr>
+                            <m:t>t</m:t>
+                          </m:r>
+                        </m:sub>
+                      </m:sSub>
+                    </m:e>
+                  </m:rad>
+                  <m:sSub>
+                    <m:sSubPr>
+                      <m:ctrlPr>
+                        <w:rPr>
+                          <w:rFonts w:ascii="Cambria Math" w:hAnsi="Cambria Math"/>
+                          <w:b/>
+                          <w:i/>
+                        </w:rPr>
+                      </m:ctrlPr>
+                    </m:sSubPr>
+                    <m:e>
+                      <m:r>
+                        <m:rPr>
+                          <m:sty m:val="bi"/>
+                        </m:rPr>
+                        <w:rPr>
+                          <w:rFonts w:ascii="Cambria Math" w:hAnsi="Cambria Math"/>
+                        </w:rPr>
+                        <m:t>ϵ</m:t>
+                      </m:r>
+                    </m:e>
+                    <m:sub>
+                      <m:r>
+                        <w:rPr>
+                          <w:rFonts w:ascii="Cambria Math" w:eastAsiaTheme="minorEastAsia" w:hAnsi="Cambria Math"/>
+                        </w:rPr>
+                        <m:t>θ</m:t>
+                      </m:r>
+                    </m:sub>
+                  </m:sSub>
+                </m:num>
+                <m:den>
+                  <m:rad>
+                    <m:radPr>
+                      <m:degHide m:val="on"/>
+                      <m:ctrlPr>
+                        <w:rPr>
+                          <w:rFonts w:ascii="Cambria Math" w:eastAsiaTheme="minorEastAsia" w:hAnsi="Cambria Math"/>
+                          <w:i/>
+                        </w:rPr>
+                      </m:ctrlPr>
+                    </m:radPr>
+                    <m:deg/>
+                    <m:e>
+                      <m:sSub>
+                        <m:sSubPr>
+                          <m:ctrlPr>
+                            <w:rPr>
+                              <w:rFonts w:ascii="Cambria Math" w:eastAsiaTheme="minorEastAsia" w:hAnsi="Cambria Math" w:cstheme="minorHAnsi"/>
+                              <w:i/>
+                            </w:rPr>
+                          </m:ctrlPr>
+                        </m:sSubPr>
+                        <m:e>
+                          <m:acc>
+                            <m:accPr>
+                              <m:chr m:val="̅"/>
+                              <m:ctrlPr>
+                                <w:rPr>
+                                  <w:rFonts w:ascii="Cambria Math" w:eastAsiaTheme="minorEastAsia" w:hAnsi="Cambria Math" w:cstheme="minorHAnsi"/>
+                                  <w:i/>
+                                </w:rPr>
+                              </m:ctrlPr>
+                            </m:accPr>
+                            <m:e>
+                              <m:r>
+                                <w:rPr>
+                                  <w:rFonts w:ascii="Cambria Math" w:eastAsiaTheme="minorEastAsia" w:cstheme="minorHAnsi"/>
+                                </w:rPr>
+                                <m:t>a</m:t>
+                              </m:r>
+                            </m:e>
+                          </m:acc>
+                        </m:e>
+                        <m:sub>
+                          <m:r>
+                            <w:rPr>
+                              <w:rFonts w:ascii="Cambria Math" w:eastAsiaTheme="minorEastAsia" w:hAnsi="Cambria Math" w:cstheme="minorHAnsi"/>
+                            </w:rPr>
+                            <m:t>t</m:t>
+                          </m:r>
+                        </m:sub>
+                      </m:sSub>
+                    </m:e>
+                  </m:rad>
+                </m:den>
+              </m:f>
+            </m:e>
+          </m:d>
+          <m:r>
+            <w:rPr>
+              <w:rFonts w:ascii="Cambria Math" w:eastAsiaTheme="minorEastAsia" w:hAnsi="Cambria Math"/>
+            </w:rPr>
+            <m:t>+</m:t>
+          </m:r>
+          <m:rad>
+            <m:radPr>
+              <m:degHide m:val="on"/>
+              <m:ctrlPr>
+                <w:rPr>
+                  <w:rFonts w:ascii="Cambria Math" w:eastAsiaTheme="minorEastAsia" w:hAnsi="Cambria Math"/>
+                  <w:i/>
+                </w:rPr>
+              </m:ctrlPr>
+            </m:radPr>
+            <m:deg/>
+            <m:e>
+              <m:sSub>
+                <m:sSubPr>
+                  <m:ctrlPr>
+                    <w:rPr>
+                      <w:rFonts w:ascii="Cambria Math" w:eastAsiaTheme="minorEastAsia" w:hAnsi="Cambria Math" w:cstheme="minorHAnsi"/>
+                      <w:i/>
+                    </w:rPr>
+                  </m:ctrlPr>
+                </m:sSubPr>
+                <m:e>
+                  <m:r>
+                    <w:rPr>
+                      <w:rFonts w:ascii="Cambria Math" w:eastAsiaTheme="minorEastAsia" w:hAnsi="Cambria Math" w:cstheme="minorHAnsi"/>
+                    </w:rPr>
+                    <m:t>1-</m:t>
+                  </m:r>
+                  <m:acc>
+                    <m:accPr>
+                      <m:chr m:val="̅"/>
+                      <m:ctrlPr>
+                        <w:rPr>
+                          <w:rFonts w:ascii="Cambria Math" w:eastAsiaTheme="minorEastAsia" w:hAnsi="Cambria Math" w:cstheme="minorHAnsi"/>
+                          <w:i/>
+                        </w:rPr>
+                      </m:ctrlPr>
+                    </m:accPr>
+                    <m:e>
+                      <m:r>
+                        <w:rPr>
+                          <w:rFonts w:ascii="Cambria Math" w:eastAsiaTheme="minorEastAsia" w:cstheme="minorHAnsi"/>
+                        </w:rPr>
+                        <m:t>a</m:t>
+                      </m:r>
+                    </m:e>
+                  </m:acc>
+                </m:e>
+                <m:sub>
+                  <m:r>
+                    <w:rPr>
+                      <w:rFonts w:ascii="Cambria Math" w:eastAsiaTheme="minorEastAsia" w:hAnsi="Cambria Math" w:cstheme="minorHAnsi"/>
+                    </w:rPr>
+                    <m:t>t-s</m:t>
+                  </m:r>
+                </m:sub>
+              </m:sSub>
+            </m:e>
+          </m:rad>
+          <m:sSub>
+            <m:sSubPr>
+              <m:ctrlPr>
+                <w:rPr>
+                  <w:rFonts w:ascii="Cambria Math" w:hAnsi="Cambria Math"/>
+                  <w:b/>
+                  <w:i/>
+                </w:rPr>
+              </m:ctrlPr>
+            </m:sSubPr>
+            <m:e>
+              <m:r>
+                <m:rPr>
+                  <m:sty m:val="bi"/>
+                </m:rPr>
+                <w:rPr>
+                  <w:rFonts w:ascii="Cambria Math" w:hAnsi="Cambria Math"/>
+                </w:rPr>
+                <m:t>ϵ</m:t>
+              </m:r>
+            </m:e>
+            <m:sub>
+              <m:r>
+                <w:rPr>
+                  <w:rFonts w:ascii="Cambria Math" w:eastAsiaTheme="minorEastAsia" w:hAnsi="Cambria Math"/>
+                </w:rPr>
+                <m:t>θ</m:t>
+              </m:r>
+            </m:sub>
+          </m:sSub>
+        </m:oMath>
+      </m:oMathPara>
     </w:p>
     <w:p>
       <w:pPr>
@@ -2508,7 +2894,6 @@
             <w:rPr>
               <w:rFonts w:ascii="Cambria Math" w:eastAsiaTheme="minorEastAsia" w:hAnsi="Cambria Math"/>
             </w:rPr>
-            <w:lastRenderedPageBreak/>
             <m:t>c:</m:t>
           </m:r>
           <m:r>
@@ -5444,7 +5829,7 @@
   <w:style w:type="paragraph" w:default="1" w:styleId="Normal">
     <w:name w:val="Normal"/>
     <w:qFormat/>
-    <w:rsid w:val="00083CB6"/>
+    <w:rsid w:val="00800084"/>
     <w:rPr>
       <w:lang w:val="en-US"/>
     </w:rPr>

</xml_diff>